<commit_message>
docs(phap-ly): chuẩn hóa mẫu nhãn hiệu 80x80 mm
</commit_message>
<xml_diff>
--- a/06_PHAP-LY-TUAN-THU/SO_HUU_TRI_TUE/01_HO_SO_DANG_KY/VC-PL-001-ToKhaiDangKyNhanHieu-REVIEW_v1.0_20260820.docx
+++ b/06_PHAP-LY-TUAN-THU/SO_HUU_TRI_TUE/01_HO_SO_DANG_KY/VC-PL-001-ToKhaiDangKyNhanHieu-REVIEW_v1.0_20260820.docx
@@ -564,7 +564,7 @@
               </w:rPr>
               <w:drawing>
                 <wp:inline distT="0" distB="0" distL="0" distR="0" wp14:anchorId="4AF93BCE" wp14:editId="2B1DEC1E">
-                  <wp:extent cx="3072063" cy="915275"/>
+                  <wp:extent cx="2880000" cy="2880000"/>
                   <wp:effectExtent l="0" t="0" r="1905" b="0"/>
                   <wp:docPr id="1940574304" name="Picture 1"/>
                   <wp:cNvGraphicFramePr>
@@ -586,7 +586,7 @@
                         <pic:spPr>
                           <a:xfrm>
                             <a:off x="0" y="0"/>
-                            <a:ext cx="3165846" cy="943216"/>
+                            <a:ext cx="2880000" cy="2880000"/>
                           </a:xfrm>
                           <a:prstGeom prst="rect">
                             <a:avLst/>
@@ -4987,7 +4987,7 @@
                 <w:sz w:val="24"/>
                 <w:lang w:val="pt-BR"/>
               </w:rPr>
-              <w:t>[X] Tờ khai, gồm 05 trang</w:t>
+              <w:t>[X] Tờ khai, gồm 06 trang</w:t>
             </w:r>
           </w:p>
         </w:tc>

</xml_diff>